<commit_message>
Update Tech Challenge 7IADT - Fase 2.docx
</commit_message>
<xml_diff>
--- a/Tech Challenge Fase 2/Tech Challenge 7IADT - Fase 2.docx
+++ b/Tech Challenge Fase 2/Tech Challenge 7IADT - Fase 2.docx
@@ -309,40 +309,68 @@
       </w:r>
     </w:p>
     <w:p>
-      <w:hyperlink r:id="rId9" w:history="1">
+      <w:pPr>
+        <w:rPr>
+          <w:rStyle w:val="Hyperlink"/>
+        </w:rPr>
+      </w:pPr>
+      <w:r>
+        <w:fldChar w:fldCharType="begin"/>
+      </w:r>
+      <w:r>
+        <w:instrText>HYPERLINK "https://github.com/fcrusco/TECHCHALLENGE_IADevs_2025/tree/main/Tech%20Challenge%20Fase%202"</w:instrText>
+      </w:r>
+      <w:r>
+        <w:fldChar w:fldCharType="separate"/>
+      </w:r>
+      <w:r>
+        <w:rPr>
+          <w:rStyle w:val="Hyperlink"/>
+        </w:rPr>
+        <w:t>GITH</w:t>
+      </w:r>
+      <w:r>
+        <w:rPr>
+          <w:rStyle w:val="Hyperlink"/>
+        </w:rPr>
+        <w:t>U</w:t>
+      </w:r>
+      <w:r>
+        <w:rPr>
+          <w:rStyle w:val="Hyperlink"/>
+        </w:rPr>
+        <w:t>B</w:t>
+      </w:r>
+    </w:p>
+    <w:p>
+      <w:r>
+        <w:fldChar w:fldCharType="end"/>
+      </w:r>
+    </w:p>
+    <w:p>
+      <w:r>
+        <w:t>Segue o link do vídeo explicando a tarefa principal:</w:t>
+      </w:r>
+    </w:p>
+    <w:p>
+      <w:hyperlink r:id="rId9" w:tgtFrame="_blank" w:history="1">
         <w:r>
           <w:rPr>
             <w:rStyle w:val="Hyperlink"/>
           </w:rPr>
-          <w:t>GITHUB</w:t>
-        </w:r>
-      </w:hyperlink>
-    </w:p>
-    <w:p/>
-    <w:p>
-      <w:r>
-        <w:t>Segue o link do vídeo explicando a tarefa principal:</w:t>
-      </w:r>
-    </w:p>
-    <w:p>
-      <w:hyperlink r:id="rId10" w:tgtFrame="_blank" w:history="1">
-        <w:r>
-          <w:rPr>
-            <w:rStyle w:val="Hyperlink"/>
-          </w:rPr>
-          <w:t xml:space="preserve">APRESENTAÇÃO DO TECH </w:t>
+          <w:t>APRESENTAÇÃO DO TECH CHAL</w:t>
         </w:r>
         <w:r>
           <w:rPr>
             <w:rStyle w:val="Hyperlink"/>
           </w:rPr>
-          <w:t>C</w:t>
+          <w:t>L</w:t>
         </w:r>
         <w:r>
           <w:rPr>
             <w:rStyle w:val="Hyperlink"/>
           </w:rPr>
-          <w:t>HALLENGE</w:t>
+          <w:t>ENGE</w:t>
         </w:r>
       </w:hyperlink>
     </w:p>
@@ -353,7 +381,7 @@
       </w:r>
     </w:p>
     <w:p>
-      <w:hyperlink r:id="rId11" w:anchor="/" w:tgtFrame="_blank" w:history="1">
+      <w:hyperlink r:id="rId10" w:anchor="/" w:tgtFrame="_blank" w:history="1">
         <w:r>
           <w:rPr>
             <w:rStyle w:val="Hyperlink"/>
@@ -369,12 +397,24 @@
       </w:r>
     </w:p>
     <w:p>
-      <w:hyperlink r:id="rId12" w:tgtFrame="_blank" w:history="1">
+      <w:hyperlink r:id="rId11" w:tgtFrame="_blank" w:history="1">
         <w:r>
           <w:rPr>
             <w:rStyle w:val="Hyperlink"/>
           </w:rPr>
-          <w:t>APLICAÇÃO WEB</w:t>
+          <w:t xml:space="preserve">APLICAÇÃO </w:t>
+        </w:r>
+        <w:r>
+          <w:rPr>
+            <w:rStyle w:val="Hyperlink"/>
+          </w:rPr>
+          <w:t>W</w:t>
+        </w:r>
+        <w:r>
+          <w:rPr>
+            <w:rStyle w:val="Hyperlink"/>
+          </w:rPr>
+          <w:t>EB</w:t>
         </w:r>
       </w:hyperlink>
     </w:p>

</xml_diff>